<commit_message>
july 1 2025 update
</commit_message>
<xml_diff>
--- a/regression_table.docx
+++ b/regression_table.docx
@@ -57,6 +57,15 @@
               </w:pBdr>
               <w:spacing w:after="100" w:before="100" w:line="240"/>
               <w:ind w:left="100" w:right="100" w:firstLine="0" w:firstLineChars="0"/>
+              <w:rPr>
+                <w:rFonts w:ascii="Arial" w:hAnsi="Arial" w:eastAsia="Arial" w:cs="Arial"/>
+                <w:i w:val="false"/>
+                <w:b w:val="false"/>
+                <w:u w:val="none"/>
+                <w:sz w:val="22"/>
+                <w:szCs w:val="22"/>
+                <w:color w:val="000000"/>
+              </w:rPr>
             </w:pPr>
             <w:r>
               <w:rPr>
@@ -101,6 +110,15 @@
               </w:pBdr>
               <w:spacing w:after="100" w:before="100" w:line="240"/>
               <w:ind w:left="100" w:right="100" w:firstLine="0" w:firstLineChars="0"/>
+              <w:rPr>
+                <w:rFonts w:ascii="Arial" w:hAnsi="Arial" w:eastAsia="Arial" w:cs="Arial"/>
+                <w:i w:val="false"/>
+                <w:b w:val="false"/>
+                <w:u w:val="none"/>
+                <w:sz w:val="22"/>
+                <w:szCs w:val="22"/>
+                <w:color w:val="000000"/>
+              </w:rPr>
             </w:pPr>
             <w:r>
               <w:rPr>
@@ -145,6 +163,15 @@
               </w:pBdr>
               <w:spacing w:after="100" w:before="100" w:line="240"/>
               <w:ind w:left="100" w:right="100" w:firstLine="0" w:firstLineChars="0"/>
+              <w:rPr>
+                <w:rFonts w:ascii="Arial" w:hAnsi="Arial" w:eastAsia="Arial" w:cs="Arial"/>
+                <w:i w:val="false"/>
+                <w:b w:val="false"/>
+                <w:u w:val="none"/>
+                <w:sz w:val="22"/>
+                <w:szCs w:val="22"/>
+                <w:color w:val="000000"/>
+              </w:rPr>
             </w:pPr>
             <w:r>
               <w:rPr>
@@ -189,6 +216,15 @@
               </w:pBdr>
               <w:spacing w:after="100" w:before="100" w:line="240"/>
               <w:ind w:left="100" w:right="100" w:firstLine="0" w:firstLineChars="0"/>
+              <w:rPr>
+                <w:rFonts w:ascii="Arial" w:hAnsi="Arial" w:eastAsia="Arial" w:cs="Arial"/>
+                <w:i w:val="false"/>
+                <w:b w:val="false"/>
+                <w:u w:val="none"/>
+                <w:sz w:val="22"/>
+                <w:szCs w:val="22"/>
+                <w:color w:val="000000"/>
+              </w:rPr>
             </w:pPr>
             <w:r>
               <w:rPr>
@@ -239,6 +275,15 @@
               </w:pBdr>
               <w:spacing w:after="100" w:before="100" w:line="240"/>
               <w:ind w:left="100" w:right="100" w:firstLine="0" w:firstLineChars="0"/>
+              <w:rPr>
+                <w:rFonts w:ascii="Arial" w:hAnsi="Arial" w:eastAsia="Arial" w:cs="Arial"/>
+                <w:i w:val="false"/>
+                <w:b w:val="false"/>
+                <w:u w:val="none"/>
+                <w:sz w:val="22"/>
+                <w:szCs w:val="22"/>
+                <w:color w:val="000000"/>
+              </w:rPr>
             </w:pPr>
             <w:r>
               <w:rPr>
@@ -283,6 +328,15 @@
               </w:pBdr>
               <w:spacing w:after="100" w:before="100" w:line="240"/>
               <w:ind w:left="100" w:right="100" w:firstLine="0" w:firstLineChars="0"/>
+              <w:rPr>
+                <w:rFonts w:ascii="Arial" w:hAnsi="Arial" w:eastAsia="Arial" w:cs="Arial"/>
+                <w:i w:val="false"/>
+                <w:b w:val="false"/>
+                <w:u w:val="none"/>
+                <w:sz w:val="22"/>
+                <w:szCs w:val="22"/>
+                <w:color w:val="000000"/>
+              </w:rPr>
             </w:pPr>
             <w:r>
               <w:rPr>
@@ -351,6 +405,15 @@
               </w:pBdr>
               <w:spacing w:after="100" w:before="100" w:line="240"/>
               <w:ind w:left="100" w:right="100" w:firstLine="0" w:firstLineChars="0"/>
+              <w:rPr>
+                <w:rFonts w:ascii="Arial" w:hAnsi="Arial" w:eastAsia="Arial" w:cs="Arial"/>
+                <w:i w:val="false"/>
+                <w:b w:val="false"/>
+                <w:u w:val="none"/>
+                <w:sz w:val="22"/>
+                <w:szCs w:val="22"/>
+                <w:color w:val="000000"/>
+              </w:rPr>
             </w:pPr>
             <w:r>
               <w:rPr>
@@ -419,6 +482,15 @@
               </w:pBdr>
               <w:spacing w:after="100" w:before="100" w:line="240"/>
               <w:ind w:left="100" w:right="100" w:firstLine="0" w:firstLineChars="0"/>
+              <w:rPr>
+                <w:rFonts w:ascii="Arial" w:hAnsi="Arial" w:eastAsia="Arial" w:cs="Arial"/>
+                <w:i w:val="false"/>
+                <w:b w:val="false"/>
+                <w:u w:val="none"/>
+                <w:sz w:val="22"/>
+                <w:szCs w:val="22"/>
+                <w:color w:val="000000"/>
+              </w:rPr>
             </w:pPr>
             <w:r>
               <w:rPr>
@@ -493,6 +565,15 @@
               </w:pBdr>
               <w:spacing w:after="100" w:before="100" w:line="240"/>
               <w:ind w:left="100" w:right="100" w:firstLine="0" w:firstLineChars="0"/>
+              <w:rPr>
+                <w:rFonts w:ascii="Arial" w:hAnsi="Arial" w:eastAsia="Arial" w:cs="Arial"/>
+                <w:i w:val="false"/>
+                <w:b w:val="false"/>
+                <w:u w:val="none"/>
+                <w:sz w:val="22"/>
+                <w:szCs w:val="22"/>
+                <w:color w:val="000000"/>
+              </w:rPr>
             </w:pPr>
             <w:r>
               <w:rPr>
@@ -537,6 +618,15 @@
               </w:pBdr>
               <w:spacing w:after="100" w:before="100" w:line="240"/>
               <w:ind w:left="100" w:right="100" w:firstLine="0" w:firstLineChars="0"/>
+              <w:rPr>
+                <w:rFonts w:ascii="Arial" w:hAnsi="Arial" w:eastAsia="Arial" w:cs="Arial"/>
+                <w:i w:val="false"/>
+                <w:b w:val="false"/>
+                <w:u w:val="none"/>
+                <w:sz w:val="22"/>
+                <w:szCs w:val="22"/>
+                <w:color w:val="000000"/>
+              </w:rPr>
             </w:pPr>
             <w:r>
               <w:rPr>
@@ -605,6 +695,15 @@
               </w:pBdr>
               <w:spacing w:after="100" w:before="100" w:line="240"/>
               <w:ind w:left="100" w:right="100" w:firstLine="0" w:firstLineChars="0"/>
+              <w:rPr>
+                <w:rFonts w:ascii="Arial" w:hAnsi="Arial" w:eastAsia="Arial" w:cs="Arial"/>
+                <w:i w:val="false"/>
+                <w:b w:val="false"/>
+                <w:u w:val="none"/>
+                <w:sz w:val="22"/>
+                <w:szCs w:val="22"/>
+                <w:color w:val="000000"/>
+              </w:rPr>
             </w:pPr>
             <w:r>
               <w:rPr>
@@ -673,6 +772,15 @@
               </w:pBdr>
               <w:spacing w:after="100" w:before="100" w:line="240"/>
               <w:ind w:left="100" w:right="100" w:firstLine="0" w:firstLineChars="0"/>
+              <w:rPr>
+                <w:rFonts w:ascii="Arial" w:hAnsi="Arial" w:eastAsia="Arial" w:cs="Arial"/>
+                <w:i w:val="false"/>
+                <w:b w:val="false"/>
+                <w:u w:val="none"/>
+                <w:sz w:val="22"/>
+                <w:szCs w:val="22"/>
+                <w:color w:val="000000"/>
+              </w:rPr>
             </w:pPr>
             <w:r>
               <w:rPr>
@@ -747,6 +855,15 @@
               </w:pBdr>
               <w:spacing w:after="100" w:before="100" w:line="240"/>
               <w:ind w:left="100" w:right="100" w:firstLine="0" w:firstLineChars="0"/>
+              <w:rPr>
+                <w:rFonts w:ascii="Arial" w:hAnsi="Arial" w:eastAsia="Arial" w:cs="Arial"/>
+                <w:i w:val="false"/>
+                <w:b w:val="false"/>
+                <w:u w:val="none"/>
+                <w:sz w:val="22"/>
+                <w:szCs w:val="22"/>
+                <w:color w:val="000000"/>
+              </w:rPr>
             </w:pPr>
             <w:r>
               <w:rPr>
@@ -791,6 +908,15 @@
               </w:pBdr>
               <w:spacing w:after="100" w:before="100" w:line="240"/>
               <w:ind w:left="100" w:right="100" w:firstLine="0" w:firstLineChars="0"/>
+              <w:rPr>
+                <w:rFonts w:ascii="Arial" w:hAnsi="Arial" w:eastAsia="Arial" w:cs="Arial"/>
+                <w:i w:val="false"/>
+                <w:b w:val="false"/>
+                <w:u w:val="none"/>
+                <w:sz w:val="22"/>
+                <w:szCs w:val="22"/>
+                <w:color w:val="000000"/>
+              </w:rPr>
             </w:pPr>
             <w:r>
               <w:rPr>
@@ -859,6 +985,15 @@
               </w:pBdr>
               <w:spacing w:after="100" w:before="100" w:line="240"/>
               <w:ind w:left="100" w:right="100" w:firstLine="0" w:firstLineChars="0"/>
+              <w:rPr>
+                <w:rFonts w:ascii="Arial" w:hAnsi="Arial" w:eastAsia="Arial" w:cs="Arial"/>
+                <w:i w:val="false"/>
+                <w:b w:val="false"/>
+                <w:u w:val="none"/>
+                <w:sz w:val="22"/>
+                <w:szCs w:val="22"/>
+                <w:color w:val="000000"/>
+              </w:rPr>
             </w:pPr>
             <w:r>
               <w:rPr>
@@ -927,6 +1062,15 @@
               </w:pBdr>
               <w:spacing w:after="100" w:before="100" w:line="240"/>
               <w:ind w:left="100" w:right="100" w:firstLine="0" w:firstLineChars="0"/>
+              <w:rPr>
+                <w:rFonts w:ascii="Arial" w:hAnsi="Arial" w:eastAsia="Arial" w:cs="Arial"/>
+                <w:i w:val="false"/>
+                <w:b w:val="false"/>
+                <w:u w:val="none"/>
+                <w:sz w:val="22"/>
+                <w:szCs w:val="22"/>
+                <w:color w:val="000000"/>
+              </w:rPr>
             </w:pPr>
             <w:r>
               <w:rPr>
@@ -1001,6 +1145,15 @@
               </w:pBdr>
               <w:spacing w:after="100" w:before="100" w:line="240"/>
               <w:ind w:left="100" w:right="100" w:firstLine="0" w:firstLineChars="0"/>
+              <w:rPr>
+                <w:rFonts w:ascii="Arial" w:hAnsi="Arial" w:eastAsia="Arial" w:cs="Arial"/>
+                <w:i w:val="false"/>
+                <w:b w:val="false"/>
+                <w:u w:val="none"/>
+                <w:sz w:val="22"/>
+                <w:szCs w:val="22"/>
+                <w:color w:val="000000"/>
+              </w:rPr>
             </w:pPr>
             <w:r>
               <w:rPr>
@@ -1045,6 +1198,15 @@
               </w:pBdr>
               <w:spacing w:after="100" w:before="100" w:line="240"/>
               <w:ind w:left="100" w:right="100" w:firstLine="0" w:firstLineChars="0"/>
+              <w:rPr>
+                <w:rFonts w:ascii="Arial" w:hAnsi="Arial" w:eastAsia="Arial" w:cs="Arial"/>
+                <w:i w:val="false"/>
+                <w:b w:val="false"/>
+                <w:u w:val="none"/>
+                <w:sz w:val="22"/>
+                <w:szCs w:val="22"/>
+                <w:color w:val="000000"/>
+              </w:rPr>
             </w:pPr>
             <w:r>
               <w:rPr>
@@ -1113,6 +1275,15 @@
               </w:pBdr>
               <w:spacing w:after="100" w:before="100" w:line="240"/>
               <w:ind w:left="100" w:right="100" w:firstLine="0" w:firstLineChars="0"/>
+              <w:rPr>
+                <w:rFonts w:ascii="Arial" w:hAnsi="Arial" w:eastAsia="Arial" w:cs="Arial"/>
+                <w:i w:val="false"/>
+                <w:b w:val="false"/>
+                <w:u w:val="none"/>
+                <w:sz w:val="22"/>
+                <w:szCs w:val="22"/>
+                <w:color w:val="000000"/>
+              </w:rPr>
             </w:pPr>
             <w:r>
               <w:rPr>
@@ -1181,6 +1352,15 @@
               </w:pBdr>
               <w:spacing w:after="100" w:before="100" w:line="240"/>
               <w:ind w:left="100" w:right="100" w:firstLine="0" w:firstLineChars="0"/>
+              <w:rPr>
+                <w:rFonts w:ascii="Arial" w:hAnsi="Arial" w:eastAsia="Arial" w:cs="Arial"/>
+                <w:i w:val="false"/>
+                <w:b w:val="false"/>
+                <w:u w:val="none"/>
+                <w:sz w:val="22"/>
+                <w:szCs w:val="22"/>
+                <w:color w:val="000000"/>
+              </w:rPr>
             </w:pPr>
             <w:r>
               <w:rPr>
@@ -1255,6 +1435,15 @@
               </w:pBdr>
               <w:spacing w:after="100" w:before="100" w:line="240"/>
               <w:ind w:left="100" w:right="100" w:firstLine="0" w:firstLineChars="0"/>
+              <w:rPr>
+                <w:rFonts w:ascii="Arial" w:hAnsi="Arial" w:eastAsia="Arial" w:cs="Arial"/>
+                <w:i w:val="false"/>
+                <w:b w:val="false"/>
+                <w:u w:val="none"/>
+                <w:sz w:val="22"/>
+                <w:szCs w:val="22"/>
+                <w:color w:val="000000"/>
+              </w:rPr>
             </w:pPr>
             <w:r>
               <w:rPr>
@@ -1299,6 +1488,15 @@
               </w:pBdr>
               <w:spacing w:after="100" w:before="100" w:line="240"/>
               <w:ind w:left="100" w:right="100" w:firstLine="0" w:firstLineChars="0"/>
+              <w:rPr>
+                <w:rFonts w:ascii="Arial" w:hAnsi="Arial" w:eastAsia="Arial" w:cs="Arial"/>
+                <w:i w:val="false"/>
+                <w:b w:val="false"/>
+                <w:u w:val="none"/>
+                <w:sz w:val="22"/>
+                <w:szCs w:val="22"/>
+                <w:color w:val="000000"/>
+              </w:rPr>
             </w:pPr>
             <w:r>
               <w:rPr>
@@ -1343,6 +1541,15 @@
               </w:pBdr>
               <w:spacing w:after="100" w:before="100" w:line="240"/>
               <w:ind w:left="100" w:right="100" w:firstLine="0" w:firstLineChars="0"/>
+              <w:rPr>
+                <w:rFonts w:ascii="Arial" w:hAnsi="Arial" w:eastAsia="Arial" w:cs="Arial"/>
+                <w:i w:val="false"/>
+                <w:b w:val="false"/>
+                <w:u w:val="none"/>
+                <w:sz w:val="22"/>
+                <w:szCs w:val="22"/>
+                <w:color w:val="000000"/>
+              </w:rPr>
             </w:pPr>
             <w:r>
               <w:rPr>
@@ -1387,6 +1594,15 @@
               </w:pBdr>
               <w:spacing w:after="100" w:before="100" w:line="240"/>
               <w:ind w:left="100" w:right="100" w:firstLine="0" w:firstLineChars="0"/>
+              <w:rPr>
+                <w:rFonts w:ascii="Arial" w:hAnsi="Arial" w:eastAsia="Arial" w:cs="Arial"/>
+                <w:i w:val="false"/>
+                <w:b w:val="false"/>
+                <w:u w:val="none"/>
+                <w:sz w:val="22"/>
+                <w:szCs w:val="22"/>
+                <w:color w:val="000000"/>
+              </w:rPr>
             </w:pPr>
             <w:r>
               <w:rPr>
@@ -1437,6 +1653,15 @@
               </w:pBdr>
               <w:spacing w:after="100" w:before="100" w:line="240"/>
               <w:ind w:left="100" w:right="100" w:firstLine="0" w:firstLineChars="0"/>
+              <w:rPr>
+                <w:rFonts w:ascii="Arial" w:hAnsi="Arial" w:eastAsia="Arial" w:cs="Arial"/>
+                <w:i w:val="false"/>
+                <w:b w:val="false"/>
+                <w:u w:val="none"/>
+                <w:sz w:val="22"/>
+                <w:szCs w:val="22"/>
+                <w:color w:val="000000"/>
+              </w:rPr>
             </w:pPr>
             <w:r>
               <w:rPr>
@@ -1481,6 +1706,15 @@
               </w:pBdr>
               <w:spacing w:after="100" w:before="100" w:line="240"/>
               <w:ind w:left="100" w:right="100" w:firstLine="0" w:firstLineChars="0"/>
+              <w:rPr>
+                <w:rFonts w:ascii="Arial" w:hAnsi="Arial" w:eastAsia="Arial" w:cs="Arial"/>
+                <w:i w:val="false"/>
+                <w:b w:val="false"/>
+                <w:u w:val="none"/>
+                <w:sz w:val="22"/>
+                <w:szCs w:val="22"/>
+                <w:color w:val="000000"/>
+              </w:rPr>
             </w:pPr>
             <w:r>
               <w:rPr>
@@ -1525,6 +1759,15 @@
               </w:pBdr>
               <w:spacing w:after="100" w:before="100" w:line="240"/>
               <w:ind w:left="100" w:right="100" w:firstLine="0" w:firstLineChars="0"/>
+              <w:rPr>
+                <w:rFonts w:ascii="Arial" w:hAnsi="Arial" w:eastAsia="Arial" w:cs="Arial"/>
+                <w:i w:val="false"/>
+                <w:b w:val="false"/>
+                <w:u w:val="none"/>
+                <w:sz w:val="22"/>
+                <w:szCs w:val="22"/>
+                <w:color w:val="000000"/>
+              </w:rPr>
             </w:pPr>
             <w:r>
               <w:rPr>
@@ -1569,6 +1812,15 @@
               </w:pBdr>
               <w:spacing w:after="100" w:before="100" w:line="240"/>
               <w:ind w:left="100" w:right="100" w:firstLine="0" w:firstLineChars="0"/>
+              <w:rPr>
+                <w:rFonts w:ascii="Arial" w:hAnsi="Arial" w:eastAsia="Arial" w:cs="Arial"/>
+                <w:i w:val="false"/>
+                <w:b w:val="false"/>
+                <w:u w:val="none"/>
+                <w:sz w:val="22"/>
+                <w:szCs w:val="22"/>
+                <w:color w:val="000000"/>
+              </w:rPr>
             </w:pPr>
             <w:r>
               <w:rPr>
@@ -1619,6 +1871,15 @@
               </w:pBdr>
               <w:spacing w:after="100" w:before="100" w:line="240"/>
               <w:ind w:left="100" w:right="100" w:firstLine="0" w:firstLineChars="0"/>
+              <w:rPr>
+                <w:rFonts w:ascii="Arial" w:hAnsi="Arial" w:eastAsia="Arial" w:cs="Arial"/>
+                <w:i w:val="false"/>
+                <w:b w:val="false"/>
+                <w:u w:val="none"/>
+                <w:sz w:val="22"/>
+                <w:szCs w:val="22"/>
+                <w:color w:val="000000"/>
+              </w:rPr>
             </w:pPr>
             <w:r>
               <w:rPr>
@@ -1663,6 +1924,15 @@
               </w:pBdr>
               <w:spacing w:after="100" w:before="100" w:line="240"/>
               <w:ind w:left="100" w:right="100" w:firstLine="0" w:firstLineChars="0"/>
+              <w:rPr>
+                <w:rFonts w:ascii="Arial" w:hAnsi="Arial" w:eastAsia="Arial" w:cs="Arial"/>
+                <w:i w:val="false"/>
+                <w:b w:val="false"/>
+                <w:u w:val="none"/>
+                <w:sz w:val="22"/>
+                <w:szCs w:val="22"/>
+                <w:color w:val="000000"/>
+              </w:rPr>
             </w:pPr>
             <w:r>
               <w:rPr>
@@ -1707,6 +1977,15 @@
               </w:pBdr>
               <w:spacing w:after="100" w:before="100" w:line="240"/>
               <w:ind w:left="100" w:right="100" w:firstLine="0" w:firstLineChars="0"/>
+              <w:rPr>
+                <w:rFonts w:ascii="Arial" w:hAnsi="Arial" w:eastAsia="Arial" w:cs="Arial"/>
+                <w:i w:val="false"/>
+                <w:b w:val="false"/>
+                <w:u w:val="none"/>
+                <w:sz w:val="22"/>
+                <w:szCs w:val="22"/>
+                <w:color w:val="000000"/>
+              </w:rPr>
             </w:pPr>
             <w:r>
               <w:rPr>
@@ -1751,6 +2030,15 @@
               </w:pBdr>
               <w:spacing w:after="100" w:before="100" w:line="240"/>
               <w:ind w:left="100" w:right="100" w:firstLine="0" w:firstLineChars="0"/>
+              <w:rPr>
+                <w:rFonts w:ascii="Arial" w:hAnsi="Arial" w:eastAsia="Arial" w:cs="Arial"/>
+                <w:i w:val="false"/>
+                <w:b w:val="false"/>
+                <w:u w:val="none"/>
+                <w:sz w:val="22"/>
+                <w:szCs w:val="22"/>
+                <w:color w:val="000000"/>
+              </w:rPr>
             </w:pPr>
             <w:r>
               <w:rPr>
@@ -1802,6 +2090,15 @@
               </w:pBdr>
               <w:spacing w:after="100" w:before="100" w:line="240"/>
               <w:ind w:left="100" w:right="100" w:firstLine="0" w:firstLineChars="0"/>
+              <w:rPr>
+                <w:rFonts w:ascii="Arial" w:hAnsi="Arial" w:eastAsia="Arial" w:cs="Arial"/>
+                <w:i w:val="false"/>
+                <w:b w:val="false"/>
+                <w:u w:val="none"/>
+                <w:sz w:val="22"/>
+                <w:szCs w:val="22"/>
+                <w:color w:val="000000"/>
+              </w:rPr>
             </w:pPr>
             <w:r>
               <w:rPr>
@@ -1853,6 +2150,15 @@
               </w:pBdr>
               <w:spacing w:after="100" w:before="100" w:line="240"/>
               <w:ind w:left="100" w:right="100" w:firstLine="0" w:firstLineChars="0"/>
+              <w:rPr>
+                <w:rFonts w:ascii="Arial" w:hAnsi="Arial" w:eastAsia="Arial" w:cs="Arial"/>
+                <w:i w:val="false"/>
+                <w:b w:val="false"/>
+                <w:u w:val="none"/>
+                <w:sz w:val="22"/>
+                <w:szCs w:val="22"/>
+                <w:color w:val="000000"/>
+              </w:rPr>
             </w:pPr>
             <w:r>
               <w:rPr>
@@ -1878,6 +2184,11 @@
     </w:sectPr>
   </w:body>
 </w:document>
+</file>
+
+<file path=word/comments.xml><?xml version="1.0" encoding="utf-8"?>
+<w:comments xmlns:wpc="http://schemas.microsoft.com/office/word/2010/wordprocessingCanvas" xmlns:mo="http://schemas.microsoft.com/office/mac/office/2008/main" xmlns:mc="http://schemas.openxmlformats.org/markup-compatibility/2006" xmlns:mv="urn:schemas-microsoft-com:mac:vml" xmlns:o="urn:schemas-microsoft-com:office:office" xmlns:r="http://schemas.openxmlformats.org/officeDocument/2006/relationships" xmlns:m="http://schemas.openxmlformats.org/officeDocument/2006/math" xmlns:v="urn:schemas-microsoft-com:vml" xmlns:wp14="http://schemas.microsoft.com/office/word/2010/wordprocessingDrawing" xmlns:wp="http://schemas.openxmlformats.org/drawingml/2006/wordprocessingDrawing" xmlns:w10="urn:schemas-microsoft-com:office:word" xmlns:w="http://schemas.openxmlformats.org/wordprocessingml/2006/main" xmlns:w14="http://schemas.microsoft.com/office/word/2010/wordml" xmlns:wpg="http://schemas.microsoft.com/office/word/2010/wordprocessingGroup" xmlns:wpi="http://schemas.microsoft.com/office/word/2010/wordprocessingInk" xmlns:wne="http://schemas.microsoft.com/office/word/2006/wordml" xmlns:wps="http://schemas.microsoft.com/office/word/2010/wordprocessingShape" mc:Ignorable="w14 wp14">
+</w:comments>
 </file>
 
 <file path=word/footnotes.xml><?xml version="1.0" encoding="utf-8"?>

</xml_diff>